<commit_message>
EdgeRouter IPv6 firewall, generator NTP/AAA fields, duplicate object audit
</commit_message>
<xml_diff>
--- a/docs/firewall-analyzer-guide.docx
+++ b/docs/firewall-analyzer-guide.docx
@@ -2480,6 +2480,22 @@
     </w:p>
     <w:p>
       <w:pPr>
+        <w:pStyle w:val="ListBullet"/>
+      </w:pPr>
+      <w:r>
+        <w:t>2026-10-07 EdgeRouter 支援 IPv6 防火牆規則（firewall ipv6-name 與介面的 ipv6-name 綁定、IPv6 位址群組）：規則頁會列出 IPv6 規則，IP 查詢依位址家族比對，稽核的「IPv6 無規則」也涵蓋 EdgeRouter。</w:t>
+      </w:r>
+    </w:p>
+    <w:p>
+      <w:pPr>
+        <w:pStyle w:val="ListBullet"/>
+      </w:pPr>
+      <w:r>
+        <w:t>2026-10-07 稽核頁新增「重複物件（可合併）」：列出同一 VDOM 內內容相同但名稱不同的位址／服務物件，以及成員相同的群組（位址的各種遮罩寫法會先統一再比對）。保留一個、把規則與群組的引用改過去後刪除其餘，可避免日後修改時漏改。此項不影響健康度分數。</w:t>
+      </w:r>
+    </w:p>
+    <w:p>
+      <w:pPr>
         <w:pStyle w:val="Heading1"/>
       </w:pPr>
       <w:r>

</xml_diff>

<commit_message>
Firewall analyzer: Juniper SRX scheduler expiry audit
</commit_message>
<xml_diff>
--- a/docs/firewall-analyzer-guide.docx
+++ b/docs/firewall-analyzer-guide.docx
@@ -2496,6 +2496,14 @@
     </w:p>
     <w:p>
       <w:pPr>
+        <w:pStyle w:val="ListBullet"/>
+      </w:pPr>
+      <w:r>
+        <w:t>Juniper SRX 排程到期（2026-10-08）：scheduler 內含年份的 start-date／stop-date 視為單次排程，規則以 scheduler-name 引用時，稽核頁「臨時規則到期」會列出已過期或 30 天內到期的規則；未寫年份的日期區間代表每年重複，不列入。</w:t>
+      </w:r>
+    </w:p>
+    <w:p>
+      <w:pPr>
         <w:pStyle w:val="Heading1"/>
       </w:pPr>
       <w:r>

</xml_diff>

<commit_message>
Add gzip uploads, firewall rule review sheet, off-hours detection, actor view details, port map CSV import and new easter eggs
</commit_message>
<xml_diff>
--- a/docs/firewall-analyzer-guide.docx
+++ b/docs/firewall-analyzer-guide.docx
@@ -2632,6 +2632,14 @@
     </w:p>
     <w:p>
       <w:pPr>
+        <w:pStyle w:val="ListBullet"/>
+      </w:pPr>
+      <w:r>
+        <w:t>稽核頁新增「規則年度清查表」：每條規則一列，彙整合規檢查、遮蔽、重複、到期、缺備註與命中數（需先匯入），並預留審查結果、審查人、備註欄，可下載 CSV 或 Markdown。</w:t>
+      </w:r>
+    </w:p>
+    <w:p>
+      <w:pPr>
         <w:pStyle w:val="Heading1"/>
       </w:pPr>
       <w:r>

</xml_diff>

<commit_message>
Batch lookup with destination NAT, port map CSV export, review sheet import, zip uploads, generator golden baseline check, account usual-hours detection, health score trend; update guides and README
</commit_message>
<xml_diff>
--- a/docs/firewall-analyzer-guide.docx
+++ b/docs/firewall-analyzer-guide.docx
@@ -2640,6 +2640,22 @@
     </w:p>
     <w:p>
       <w:pPr>
+        <w:pStyle w:val="ListBullet"/>
+      </w:pPr>
+      <w:r>
+        <w:t>批次查詢套用目的 NAT：查詢頁勾選「考慮目的 NAT」時，批次查詢與規則變更模擬也會依 VIP／static NAT 換算目的位址，結果表與 CSV 多「目的 NAT」欄；廠牌判斷不出 NAT 先後順序時另列轉換後位址的查詢結果。</w:t>
+      </w:r>
+    </w:p>
+    <w:p>
+      <w:pPr>
+        <w:pStyle w:val="ListBullet"/>
+      </w:pPr>
+      <w:r>
+        <w:t>規則清查表回填：清查表下載後在「審查結果」欄填入刪除或停用，回到稽核頁「匯入已審查的清查表」，對應規則會加入規則變更模擬清單，可先模擬再執行；FortiGate 另可下載對應的刪除與停用指令（停用為 set status disable）。找不到的規則 ID 會列出。</w:t>
+      </w:r>
+    </w:p>
+    <w:p>
+      <w:pPr>
         <w:pStyle w:val="Heading1"/>
       </w:pPr>
       <w:r>

</xml_diff>

<commit_message>
Tighten broad rules from log traffic, account new login source, VLAN matrix, Cloudflare Logpush, Sigma rule import, bulk golden baseline check, health sparkline; update guides and README
</commit_message>
<xml_diff>
--- a/docs/firewall-analyzer-guide.docx
+++ b/docs/firewall-analyzer-guide.docx
@@ -2656,6 +2656,14 @@
     </w:p>
     <w:p>
       <w:pPr>
+        <w:pStyle w:val="ListBullet"/>
+      </w:pPr>
+      <w:r>
+        <w:t>依實際流量收斂建議：批次查詢（包含從 log 分析工具送來的批次反查）之後，若有放行結果命中來源、目的或服務為不限（all／any、0.0.0.0/0 位址物件、ALL 服務）的規則，查詢頁下方會依規則列出實際出現過的來源、目的與協定／埠及筆數，可匯出 CSV。FortiGate 另可下載指令草稿：把觀察到的位址建成 /32 位址物件、協定／埠建成自訂服務，只修改不限的欄位；IPv6、沒有埠號或超過 50 個值的欄位不修改並在註解說明。只看得到 log 期間出現的流量，收斂前請確認沒有遺漏的合法流量。</w:t>
+      </w:r>
+    </w:p>
+    <w:p>
+      <w:pPr>
         <w:pStyle w:val="Heading1"/>
       </w:pPr>
       <w:r>

</xml_diff>

<commit_message>
Fix unused-object audit for groups, NAT and shared objects; recert, tighten suggestion, port map and log fixes
</commit_message>
<xml_diff>
--- a/docs/firewall-analyzer-guide.docx
+++ b/docs/firewall-analyzer-guide.docx
@@ -2664,6 +2664,14 @@
     </w:p>
     <w:p>
       <w:pPr>
+        <w:pStyle w:val="ListBullet"/>
+      </w:pPr>
+      <w:r>
+        <w:t>未使用物件判斷修正：被有使用中群組包含的位址與服務物件（含 Cisco ASA 的 object／object-group／group-object 成員）、NAT 引用的物件、Juniper 全域通訊錄與 Palo Alto shared 等共用物件，都算使用中；只被同樣未使用的群組包含的物件仍會列出，並註明包含它的群組（清理指令會先刪群組再刪成員）。</w:t>
+      </w:r>
+    </w:p>
+    <w:p>
+      <w:pPr>
         <w:pStyle w:val="Heading1"/>
       </w:pPr>
       <w:r>

</xml_diff>

<commit_message>
Faster analysis for large logs and firewall configs
</commit_message>
<xml_diff>
--- a/docs/firewall-analyzer-guide.docx
+++ b/docs/firewall-analyzer-guide.docx
@@ -2672,6 +2672,14 @@
     </w:p>
     <w:p>
       <w:pPr>
+        <w:pStyle w:val="ListBullet"/>
+      </w:pPr>
+      <w:r>
+        <w:t>大型設定稽核加速：規則與位址物件數千筆時，未使用物件、遮蔽與健康度的計算明顯變快（6000 條規則的健康度由約 3 秒降到約 1 秒），同一次分析中各頁重複使用的稽核結果不再重算。</w:t>
+      </w:r>
+    </w:p>
+    <w:p>
+      <w:pPr>
         <w:pStyle w:val="Heading1"/>
       </w:pPr>
       <w:r>

</xml_diff>

<commit_message>
韌體漏洞內建清單加入廠商公告（FortiOS 10/22 修補版、PHP2Shell、Juniper／NX-OS／Arista／AOS-CX／Dell OS10），新增 RouterOS 與 Dell OS10 版本比對
Co-Authored-By: Claude Opus 5.5 <noreply@anthropic.com>
Claude-Session: https://claude.ai/code/session_01KyMrsQBgHKfxe2bM1723sh
</commit_message>
<xml_diff>
--- a/docs/firewall-analyzer-guide.docx
+++ b/docs/firewall-analyzer-guide.docx
@@ -2752,6 +2752,14 @@
     </w:p>
     <w:p>
       <w:pPr>
+        <w:pStyle w:val="ListBullet"/>
+      </w:pPr>
+      <w:r>
+        <w:t>韌體漏洞內建清單擴充（2026-10-27）：內建清單除 CISA KEV 外，加入近期重大廠商公告（來源欄標「內建（廠商公告）」），包含 FortiOS 2026-10-22 安全強化版（7.6.0–7.6.7、7.4.0–7.4.12、7.2.0–7.2.13、8.0.0–8.0.1 請升級至 7.6.8／7.4.13／7.2.14／8.0.2；CVE 預計 11/10 公布）、PAN-OS／Panorama PHP2Shell（10.2／11.1／11.2／12.1／12.2，修補版待廠商公告）與 Juniper 2026-10 公告。新增 MikroTik RouterOS 版本比對（讀匯出檔頭版本，含 2026 年已遭利用的 RouterOS 漏洞）。pfSense／OPNsense 設定檔沒有韌體版本，改在漏洞卡片提醒 PHP2Shell 修補版本（OPNsense 26.7.7／26.4.2p3）。</w:t>
+      </w:r>
+    </w:p>
+    <w:p>
+      <w:pPr>
         <w:pStyle w:val="Heading1"/>
       </w:pPr>
       <w:r>

</xml_diff>

<commit_message>
內建漏洞清單補上 Cisco ASA 7 筆 KEV 漏洞（含 SafePay 利用的 CVE-2023-20269）
Co-Authored-By: Claude Opus 5.5 <noreply@anthropic.com>
Claude-Session: https://claude.ai/code/session_01KyMrsQBgHKfxe2bM1723sh
</commit_message>
<xml_diff>
--- a/docs/firewall-analyzer-guide.docx
+++ b/docs/firewall-analyzer-guide.docx
@@ -2760,6 +2760,14 @@
     </w:p>
     <w:p>
       <w:pPr>
+        <w:pStyle w:val="ListBullet"/>
+      </w:pPr>
+      <w:r>
+        <w:t>Cisco ASA 內建漏洞比對補齊（2026-10-27）：原本內建清單的 ASA 項目因版本寫法不同（CVE 紀錄寫 9.8.1.5、設備寫 9.8(1)5）而無法比對，現已轉換收錄 7 筆 CISA KEV 漏洞，包含 SafePay 勒索軟體（CISA AA26-293A）利用的 CVE-2023-20269。比對依 Cisco 列出的受影響版本逐一比對，未列出的版本不判定。CVE-2020-3259 因 Cisco 紀錄沒有版本資料，仍無法收錄。</w:t>
+      </w:r>
+    </w:p>
+    <w:p>
+      <w:pPr>
         <w:pStyle w:val="Heading1"/>
       </w:pPr>
       <w:r>

</xml_diff>

<commit_message>
韌體漏洞比對支援 Check Point Gaia（Jumbo Hotfix Take）
</commit_message>
<xml_diff>
--- a/docs/firewall-analyzer-guide.docx
+++ b/docs/firewall-analyzer-guide.docx
@@ -2896,6 +2896,14 @@
     </w:p>
     <w:p>
       <w:pPr>
+        <w:pStyle w:val="ListBullet"/>
+      </w:pPr>
+      <w:r>
+        <w:t>韌體漏洞比對支援 Check Point Gaia：在韌體卡片補填「R81.20 Take 141」（Jumbo Hotfix Take，可用 cpinfo -y all 查詢）即可比對內建 KEV 清單；只填 R81.20 時依 Take 判斷的漏洞顯示無法判斷、不扣健康度。</w:t>
+      </w:r>
+    </w:p>
+    <w:p>
+      <w:pPr>
         <w:pStyle w:val="Heading1"/>
       </w:pPr>
       <w:r>

</xml_diff>